<commit_message>
individuation-mcmc: guideline-conformant CB&B submission pack
Conforms the submission to the Computational Brain & Behavior author guidelines:
- Abstract trimmed to 236 words (150-250 cap).
- Separate Title Page (author, Independent Researcher affiliation, corresponding
  email, ORCID, abstract, 6 keywords, full Statements and Declarations).
- Declarations section added before References (Funding, Competing Interests,
  Ethics approval, Consent, Data and Code availability, Author Contributions,
  Use of LLMs), plus an LLM-use note in Methods per Springer policy.
- Cover letter.
All author-facing files carry no em-dashes; numbers verified against results.
Staged deliverables also copied to the local submissions folder.
</commit_message>
<xml_diff>
--- a/experiments/influence/individuation-mcmc/paper/Individuation_CBB_submission.docx
+++ b/experiments/influence/individuation-mcmc/paper/Individuation_CBB_submission.docx
@@ -2,7 +2,7 @@
 <file path=word/document.xml><?xml version="1.0" encoding="utf-8"?>
 <w:document xmlns:w="http://schemas.openxmlformats.org/wordprocessingml/2006/main" xmlns:m="http://schemas.openxmlformats.org/officeDocument/2006/math" xmlns:r="http://schemas.openxmlformats.org/officeDocument/2006/relationships" xmlns:o="urn:schemas-microsoft-com:office:office" xmlns:v="urn:schemas-microsoft-com:vml" xmlns:w10="urn:schemas-microsoft-com:office:word" xmlns:a="http://schemas.openxmlformats.org/drawingml/2006/main" xmlns:pic="http://schemas.openxmlformats.org/drawingml/2006/picture" xmlns:wp="http://schemas.openxmlformats.org/drawingml/2006/wordprocessingDrawing">
   <w:body>
-    <w:bookmarkStart w:id="41" w:name="Xa211fd7dc0f35100304f931a2cfef36c1eedb77"/>
+    <w:bookmarkStart w:id="42" w:name="Xa211fd7dc0f35100304f931a2cfef36c1eedb77"/>
     <w:p>
       <w:pPr>
         <w:pStyle w:val="Heading1"/>
@@ -25,7 +25,7 @@
         <w:pStyle w:val="FirstParagraph"/>
       </w:pPr>
       <w:r>
-        <w:t xml:space="preserve">A person’s choices and reaction times carry information about how they decide and how they learn. We ask how far that information supports three increasingly demanding claims: that a model fit to one person recovers their parameters, that it individuates them (predicts the same person better than a group model or another person), and that it estimates how susceptible that person is to covert influence. We fit a hierarchical Bayesian drift-diffusion model with a Rescorla-Wagner learning rule to choices and reaction times, and we validate the manipulability step against a full nonlinear attractor circuit using simulation-based inference. On synthetic agents with known ground truth, the decision-state parameters recover almost perfectly (r = 0.86 to 0.99) and the learning-rule parameters moderately (learning rate r = 0.67), and the per-person fit predicts held-out behavior better than a pooled model and an identity-shuffle control. On a real probabilistic reversal-learning dataset with a test-retest design (150 participants), the decision-state fingerprint is reliable across sessions (non-decision time r = 0.71, boundary r = 0.60) and individuates: a session-one fit predicts the same participant’s session-two behavior better than another participant’s fit in 115 of 150 cases. We then show a cautionary result for the manipulability claim. A reduced-model capture dose, the covert drive that flips an ambiguous decision, fails to recover the full-circuit capture dose (rank correlation -0.25, a null at n = 14), whereas computing the capture dose directly in the full circuit from simulation-based inference recovers the ground-truth value at the same sample size (rank correlation 0.90). We draw a clear line: individuation of the decision process is supported, including on real behavior, while susceptibility to covert steering is estimable only in simulation and only when computed in the generative circuit, not its reduction, and is never validated on a real person. We argue this separation is the responsible way to study behavioral individuation that bears on manipulation risk.</w:t>
+        <w:t xml:space="preserve">A person’s choices and reaction times carry information about how they decide and how they learn. We ask how far that information supports three increasingly demanding claims: that a model fit to one person recovers their parameters, that it individuates them (predicts the same person better than a group model or another person), and that it estimates how susceptible that person is to covert influence. We fit a hierarchical Bayesian drift-diffusion model with a Rescorla-Wagner learning rule to choices and reaction times, and validate a manipulability measure against a full nonlinear attractor circuit using simulation-based inference. On synthetic agents, decision-state parameters recover well (r = 0.86 to 0.99) and the per-person fit beats an identity-shuffle control (14 of 14). On a real probabilistic reversal-learning dataset with a test-retest design (150 participants), the decision-state fingerprint is reliable across sessions (non-decision time r = 0.71) and individuates: a session-one fit predicts the same participant’s session-two behavior better than another participant’s fit in 115 of 150 cases. For susceptibility we report a cautionary result. A reduced-model capture dose fails to recover the full-circuit value (rank correlation near zero), whereas computing it directly in the circuit by simulation-based inference recovers the ground truth (rank correlation 0.90). Individuation of the decision process is thus supported, including on real behavior, while susceptibility to covert steering is estimable only in simulation, only in the generative circuit, and never validated on a real person.</w:t>
       </w:r>
     </w:p>
     <w:bookmarkEnd w:id="9"/>
@@ -111,7 +111,7 @@
       </w:r>
     </w:p>
     <w:bookmarkEnd w:id="10"/>
-    <w:bookmarkStart w:id="16" w:name="methods"/>
+    <w:bookmarkStart w:id="17" w:name="methods"/>
     <w:p>
       <w:pPr>
         <w:pStyle w:val="Heading2"/>
@@ -210,8 +210,26 @@
       </w:r>
     </w:p>
     <w:bookmarkEnd w:id="15"/>
+    <w:bookmarkStart w:id="16" w:name="use-of-large-language-models"/>
+    <w:p>
+      <w:pPr>
+        <w:pStyle w:val="Heading3"/>
+      </w:pPr>
+      <w:r>
+        <w:t xml:space="preserve">2.6 Use of large language models</w:t>
+      </w:r>
+    </w:p>
+    <w:p>
+      <w:pPr>
+        <w:pStyle w:val="FirstParagraph"/>
+      </w:pPr>
+      <w:r>
+        <w:t xml:space="preserve">Code and manuscript text were prepared with the assistance of a large language model (Claude). All generated code was executed and checked against held-out simulations and against the recomputed results reported here, and the author is accountable for the full content.</w:t>
+      </w:r>
+    </w:p>
     <w:bookmarkEnd w:id="16"/>
-    <w:bookmarkStart w:id="34" w:name="results"/>
+    <w:bookmarkEnd w:id="17"/>
+    <w:bookmarkStart w:id="35" w:name="results"/>
     <w:p>
       <w:pPr>
         <w:pStyle w:val="Heading2"/>
@@ -220,7 +238,7 @@
         <w:t xml:space="preserve">3. Results</w:t>
       </w:r>
     </w:p>
-    <w:bookmarkStart w:id="20" w:name="parameter-recovery-synthetic"/>
+    <w:bookmarkStart w:id="21" w:name="parameter-recovery-synthetic"/>
     <w:p>
       <w:pPr>
         <w:pStyle w:val="Heading3"/>
@@ -246,18 +264,18 @@
           <wp:inline>
             <wp:extent cx="5334000" cy="3394363"/>
             <wp:effectExtent b="0" l="0" r="0" t="0"/>
-            <wp:docPr descr="Figure 1. Per-subject parameter recovery on a synthetic cohort (true value versus posterior mean, 14 subjects). Decision-state parameters (a, w, t0, beta) fall near the diagonal; the learning-rule parameters (alpha, w_q) recover moderately." title="" id="18" name="Picture"/>
+            <wp:docPr descr="Figure 1. Per-subject parameter recovery on a synthetic cohort (true value versus posterior mean, 14 subjects). Decision-state parameters (a, w, t0, beta) fall near the diagonal; the learning-rule parameters (alpha, w_q) recover moderately." title="" id="19" name="Picture"/>
             <a:graphic>
               <a:graphicData uri="http://schemas.openxmlformats.org/drawingml/2006/picture">
                 <pic:pic>
                   <pic:nvPicPr>
-                    <pic:cNvPr descr="../figures/recovery.png" id="19" name="Picture"/>
+                    <pic:cNvPr descr="../figures/recovery.png" id="20" name="Picture"/>
                     <pic:cNvPicPr>
                       <a:picLocks noChangeArrowheads="1" noChangeAspect="1"/>
                     </pic:cNvPicPr>
                   </pic:nvPicPr>
                   <pic:blipFill>
-                    <a:blip r:embed="rId17"/>
+                    <a:blip r:embed="rId18"/>
                     <a:stretch>
                       <a:fillRect/>
                     </a:stretch>
@@ -292,8 +310,8 @@
         <w:t xml:space="preserve">Figure 1. Per-subject parameter recovery on a synthetic cohort (true value versus posterior mean, 14 subjects). Decision-state parameters (a, w, t0, beta) fall near the diagonal; the learning-rule parameters (alpha, w_q) recover moderately.</w:t>
       </w:r>
     </w:p>
-    <w:bookmarkEnd w:id="20"/>
-    <w:bookmarkStart w:id="21" w:name="individuation-out-of-sample-synthetic"/>
+    <w:bookmarkEnd w:id="21"/>
+    <w:bookmarkStart w:id="22" w:name="individuation-out-of-sample-synthetic"/>
     <w:p>
       <w:pPr>
         <w:pStyle w:val="Heading3"/>
@@ -310,8 +328,8 @@
         <w:t xml:space="preserve">Fitting on the first 70 percent of trials and scoring the last 30 percent, the per-person fit predicts each subject’s held-out behavior better than another subject’s fit (identity-shuffle control) in all 14 of 14 cases (binomial p = 1.2e-4). This identity-shuffle margin is the load-bearing test, because it isolates the identity of the subject from generic structure that a group model would also capture. The per-person fit also beats a pooled group model in 10 of 14 subjects, but at this sample size that comparison is not significant on its own (binomial p = 0.18) and we do not rely on it; the identity-shuffle result is the one that establishes individuation here.</w:t>
       </w:r>
     </w:p>
-    <w:bookmarkEnd w:id="21"/>
-    <w:bookmarkStart w:id="22" w:name="Xeb773a4fc884515707d518f0e3930f57c0b2f2a"/>
+    <w:bookmarkEnd w:id="22"/>
+    <w:bookmarkStart w:id="23" w:name="Xeb773a4fc884515707d518f0e3930f57c0b2f2a"/>
     <w:p>
       <w:pPr>
         <w:pStyle w:val="Heading3"/>
@@ -328,8 +346,8 @@
         <w:t xml:space="preserve">Across 14 full-circuit settings, a capture dose predicted by a reduced-model fit to behavior fails to recover the capture dose measured directly in the attractor circuit: the rank correlation is -0.25 (p = 0.40, n = 14), a null rather than a positive association, with both quantities showing substantial spread. This is an underpowered null on its own, so we do not claim negative transfer; the force of the result is the contrast with Section 3.4, where the full-circuit route recovers the same ground-truth capture dose at rank correlation 0.90 on the same number of settings. At equal sample size, one route recovers susceptibility and the other does not. Approximate Bayesian computation does recover the circuit’s own parameters from behavior (noise recovery r = 1.00, inhibition recovery r = 0.66), so the circuit is identifiable and the failure is specific to passing the capture dose through the reduction.</w:t>
       </w:r>
     </w:p>
-    <w:bookmarkEnd w:id="22"/>
-    <w:bookmarkStart w:id="29" w:name="X3c294cc36424ba957537c4464b6fd5599996273"/>
+    <w:bookmarkEnd w:id="23"/>
+    <w:bookmarkStart w:id="30" w:name="X3c294cc36424ba957537c4464b6fd5599996273"/>
     <w:p>
       <w:pPr>
         <w:pStyle w:val="Heading3"/>
@@ -355,18 +373,18 @@
           <wp:inline>
             <wp:extent cx="5334000" cy="2032000"/>
             <wp:effectExtent b="0" l="0" r="0" t="0"/>
-            <wp:docPr descr="Figure 2. The reduction does not recover susceptibility, the full circuit does. Left: likelihood-free (approximate Bayesian computation) recovery of the circuit parameter J_cross from behavior. Right: the reduced-model capture dose does not track the full-circuit capture dose across settings." title="" id="24" name="Picture"/>
+            <wp:docPr descr="Figure 2. The reduction does not recover susceptibility, the full circuit does. Left: likelihood-free (approximate Bayesian computation) recovery of the circuit parameter J_cross from behavior. Right: the reduced-model capture dose does not track the full-circuit capture dose across settings." title="" id="25" name="Picture"/>
             <a:graphic>
               <a:graphicData uri="http://schemas.openxmlformats.org/drawingml/2006/picture">
                 <pic:pic>
                   <pic:nvPicPr>
-                    <pic:cNvPr descr="../figures/sbi_crosscheck.png" id="25" name="Picture"/>
+                    <pic:cNvPr descr="../figures/sbi_crosscheck.png" id="26" name="Picture"/>
                     <pic:cNvPicPr>
                       <a:picLocks noChangeArrowheads="1" noChangeAspect="1"/>
                     </pic:cNvPicPr>
                   </pic:nvPicPr>
                   <pic:blipFill>
-                    <a:blip r:embed="rId23"/>
+                    <a:blip r:embed="rId24"/>
                     <a:stretch>
                       <a:fillRect/>
                     </a:stretch>
@@ -410,18 +428,18 @@
           <wp:inline>
             <wp:extent cx="4754880" cy="4206240"/>
             <wp:effectExtent b="0" l="0" r="0" t="0"/>
-            <wp:docPr descr="Figure 3. Full-circuit susceptibility via simulation-based inference. Capture dose inferred from the approximate-Bayesian-computation posterior versus ground truth, with 90 percent posterior intervals; points fall on the diagonal (rank correlation 0.90)." title="" id="27" name="Picture"/>
+            <wp:docPr descr="Figure 3. Full-circuit susceptibility via simulation-based inference. Capture dose inferred from the approximate-Bayesian-computation posterior versus ground truth, with 90 percent posterior intervals; points fall on the diagonal (rank correlation 0.90)." title="" id="28" name="Picture"/>
             <a:graphic>
               <a:graphicData uri="http://schemas.openxmlformats.org/drawingml/2006/picture">
                 <pic:pic>
                   <pic:nvPicPr>
-                    <pic:cNvPr descr="../figures/sbi_manipulability.png" id="28" name="Picture"/>
+                    <pic:cNvPr descr="../figures/sbi_manipulability.png" id="29" name="Picture"/>
                     <pic:cNvPicPr>
                       <a:picLocks noChangeArrowheads="1" noChangeAspect="1"/>
                     </pic:cNvPicPr>
                   </pic:nvPicPr>
                   <pic:blipFill>
-                    <a:blip r:embed="rId26"/>
+                    <a:blip r:embed="rId27"/>
                     <a:stretch>
                       <a:fillRect/>
                     </a:stretch>
@@ -456,8 +474,8 @@
         <w:t xml:space="preserve">Figure 3. Full-circuit susceptibility via simulation-based inference. Capture dose inferred from the approximate-Bayesian-computation posterior versus ground truth, with 90 percent posterior intervals; points fall on the diagonal (rank correlation 0.90).</w:t>
       </w:r>
     </w:p>
-    <w:bookmarkEnd w:id="29"/>
-    <w:bookmarkStart w:id="33" w:name="individuation-on-real-behavior"/>
+    <w:bookmarkEnd w:id="30"/>
+    <w:bookmarkStart w:id="34" w:name="individuation-on-real-behavior"/>
     <w:p>
       <w:pPr>
         <w:pStyle w:val="Heading3"/>
@@ -483,18 +501,18 @@
           <wp:inline>
             <wp:extent cx="5334000" cy="2133600"/>
             <wp:effectExtent b="0" l="0" r="0" t="0"/>
-            <wp:docPr descr="Figure 4. Individuation on real behavior (Waltmann et al. 2022, 150 participants, test-retest). Left: test-retest of the fitted learning rate across sessions. Right: a participant’s session-one fit predicts their session-two behavior better than another participant’s fit (115 of 150)." title="" id="31" name="Picture"/>
+            <wp:docPr descr="Figure 4. Individuation on real behavior (Waltmann et al. 2022, 150 participants, test-retest). Left: test-retest of the fitted learning rate across sessions. Right: a participant’s session-one fit predicts their session-two behavior better than another participant’s fit (115 of 150)." title="" id="32" name="Picture"/>
             <a:graphic>
               <a:graphicData uri="http://schemas.openxmlformats.org/drawingml/2006/picture">
                 <pic:pic>
                   <pic:nvPicPr>
-                    <pic:cNvPr descr="../figures/realdata.png" id="32" name="Picture"/>
+                    <pic:cNvPr descr="../figures/realdata.png" id="33" name="Picture"/>
                     <pic:cNvPicPr>
                       <a:picLocks noChangeArrowheads="1" noChangeAspect="1"/>
                     </pic:cNvPicPr>
                   </pic:nvPicPr>
                   <pic:blipFill>
-                    <a:blip r:embed="rId30"/>
+                    <a:blip r:embed="rId31"/>
                     <a:stretch>
                       <a:fillRect/>
                     </a:stretch>
@@ -529,9 +547,9 @@
         <w:t xml:space="preserve">Figure 4. Individuation on real behavior (Waltmann et al. 2022, 150 participants, test-retest). Left: test-retest of the fitted learning rate across sessions. Right: a participant’s session-one fit predicts their session-two behavior better than another participant’s fit (115 of 150).</w:t>
       </w:r>
     </w:p>
-    <w:bookmarkEnd w:id="33"/>
     <w:bookmarkEnd w:id="34"/>
-    <w:bookmarkStart w:id="37" w:name="discussion"/>
+    <w:bookmarkEnd w:id="35"/>
+    <w:bookmarkStart w:id="38" w:name="discussion"/>
     <w:p>
       <w:pPr>
         <w:pStyle w:val="Heading2"/>
@@ -556,7 +574,7 @@
         <w:t xml:space="preserve">Susceptibility to covert steering is a different kind of claim and must be treated differently. We find that a susceptibility estimate derived from a reduced model fails to recover the generative circuit’s capture dose, even when the reduced model fits the behavior well, whereas a susceptibility estimate computed in the generative circuit from simulation-based inference recovers the ground truth at the same sample size. The practical lesson is that a model that predicts choices is not thereby a model that predicts manipulability; the latter is a derivative quantity that depends on the full dynamics near the decision boundary. The methodological lesson is that simulation-based inference, which fits the generative model directly, is the appropriate tool for susceptibility, and the analytic reduction is appropriate for individuation.</w:t>
       </w:r>
     </w:p>
-    <w:bookmarkStart w:id="35" w:name="limitations"/>
+    <w:bookmarkStart w:id="36" w:name="limitations"/>
     <w:p>
       <w:pPr>
         <w:pStyle w:val="Heading3"/>
@@ -573,8 +591,8 @@
         <w:t xml:space="preserve">The synthetic results share a functional form between the generating and fitting models, so recovery there is a necessary check rather than evidence that the form is correct for people. On real data the learning-rule parameters are unreliable, so the learning-rule layer is not yet a dependable individual readout. Susceptibility is never validated on a real person: a ground-truth capture dose would require an actual covert-steering intervention, which we do not perform and which raises its own ethical questions. The susceptibility figures are therefore properties of the models, not calibrated statements about any real individual. No neural data is used.</w:t>
       </w:r>
     </w:p>
-    <w:bookmarkEnd w:id="35"/>
-    <w:bookmarkStart w:id="36" w:name="ethics-and-intended-use"/>
+    <w:bookmarkEnd w:id="36"/>
+    <w:bookmarkStart w:id="37" w:name="ethics-and-intended-use"/>
     <w:p>
       <w:pPr>
         <w:pStyle w:val="Heading3"/>
@@ -591,9 +609,9 @@
         <w:t xml:space="preserve">The same quantity that an adversary would want, how cheaply a decision can be flipped, is the quantity a monitor uses to detect steering before it succeeds; in our simulations a monitor that observes on the order of ten of a person’s decisions detects the covert drive before it flips the choice for most subjects. We present the individuation result, which works on real behavior, together with the explicit finding that susceptibility is a simulation-only quantity, precisely so that the manipulation-relevant claim is not read as more established than it is. We release code and aggregate results; we do not redistribute the human dataset, which remains available from its original source under its own licence.</w:t>
       </w:r>
     </w:p>
-    <w:bookmarkEnd w:id="36"/>
     <w:bookmarkEnd w:id="37"/>
-    <w:bookmarkStart w:id="38" w:name="conclusion"/>
+    <w:bookmarkEnd w:id="38"/>
+    <w:bookmarkStart w:id="39" w:name="conclusion"/>
     <w:p>
       <w:pPr>
         <w:pStyle w:val="Heading2"/>
@@ -610,14 +628,14 @@
         <w:t xml:space="preserve">From choices and reaction times, a hierarchical Bayesian decision model individuates a person, on synthetic agents and on real test-retest behavior. The further step of estimating susceptibility to covert steering is estimable only in simulation and only when computed in the generative circuit rather than its reduction, and is not validated on real people. Keeping these claims separate is, in our view, the responsible way to study behavioral individuation that touches on manipulation.</w:t>
       </w:r>
     </w:p>
-    <w:bookmarkEnd w:id="38"/>
-    <w:bookmarkStart w:id="39" w:name="data-and-code-availability"/>
+    <w:bookmarkEnd w:id="39"/>
+    <w:bookmarkStart w:id="40" w:name="declarations"/>
     <w:p>
       <w:pPr>
         <w:pStyle w:val="Heading2"/>
       </w:pPr>
       <w:r>
-        <w:t xml:space="preserve">Data and code availability</w:t>
+        <w:t xml:space="preserve">Declarations</w:t>
       </w:r>
     </w:p>
     <w:p>
@@ -625,11 +643,129 @@
         <w:pStyle w:val="FirstParagraph"/>
       </w:pPr>
       <w:r>
-        <w:t xml:space="preserve">Code and aggregate results are available in the cognitive-influence-lab repository. The human dataset is the probabilistic reversal-learning data of Waltmann, Schlagenhauf, and Deserno (2022), available under a Creative Commons Attribution licence from the original authors; it is not redistributed here.</w:t>
-      </w:r>
-    </w:p>
-    <w:bookmarkEnd w:id="39"/>
-    <w:bookmarkStart w:id="40" w:name="references"/>
+        <w:rPr>
+          <w:b/>
+          <w:bCs/>
+        </w:rPr>
+        <w:t xml:space="preserve">Funding.</w:t>
+      </w:r>
+      <w:r>
+        <w:t xml:space="preserve"> </w:t>
+      </w:r>
+      <w:r>
+        <w:t xml:space="preserve">No funding was received to assist with the preparation of this manuscript.</w:t>
+      </w:r>
+    </w:p>
+    <w:p>
+      <w:pPr>
+        <w:pStyle w:val="BodyText"/>
+      </w:pPr>
+      <w:r>
+        <w:rPr>
+          <w:b/>
+          <w:bCs/>
+        </w:rPr>
+        <w:t xml:space="preserve">Competing interests.</w:t>
+      </w:r>
+      <w:r>
+        <w:t xml:space="preserve"> </w:t>
+      </w:r>
+      <w:r>
+        <w:t xml:space="preserve">The author has no relevant financial or non-financial interests to disclose.</w:t>
+      </w:r>
+    </w:p>
+    <w:p>
+      <w:pPr>
+        <w:pStyle w:val="BodyText"/>
+      </w:pPr>
+      <w:r>
+        <w:rPr>
+          <w:b/>
+          <w:bCs/>
+        </w:rPr>
+        <w:t xml:space="preserve">Ethics approval.</w:t>
+      </w:r>
+      <w:r>
+        <w:t xml:space="preserve"> </w:t>
+      </w:r>
+      <w:r>
+        <w:t xml:space="preserve">This work is a secondary computational analysis of a publicly available, de-identified behavioral dataset and of synthetic data generated by the author. No new data were collected from human participants. No ethics approval was required.</w:t>
+      </w:r>
+    </w:p>
+    <w:p>
+      <w:pPr>
+        <w:pStyle w:val="BodyText"/>
+      </w:pPr>
+      <w:r>
+        <w:rPr>
+          <w:b/>
+          <w:bCs/>
+        </w:rPr>
+        <w:t xml:space="preserve">Consent to participate and consent to publish.</w:t>
+      </w:r>
+      <w:r>
+        <w:t xml:space="preserve"> </w:t>
+      </w:r>
+      <w:r>
+        <w:t xml:space="preserve">Not applicable. No new human participants were involved, and no individual-level or identifying data are reported; all human-data results are aggregate statistics over a public dataset.</w:t>
+      </w:r>
+    </w:p>
+    <w:p>
+      <w:pPr>
+        <w:pStyle w:val="BodyText"/>
+      </w:pPr>
+      <w:r>
+        <w:rPr>
+          <w:b/>
+          <w:bCs/>
+        </w:rPr>
+        <w:t xml:space="preserve">Data and code availability.</w:t>
+      </w:r>
+      <w:r>
+        <w:t xml:space="preserve"> </w:t>
+      </w:r>
+      <w:r>
+        <w:t xml:space="preserve">Code and aggregate results are available in the author’s cognitive-influence-lab repository. The human dataset is the probabilistic reversal-learning data of Waltmann, Schlagenhauf, and Deserno (2022), available under a Creative Commons Attribution 4.0 licence from the original authors (https://osf.io/4ng3e/); it is not redistributed here. No individual-level data are reported, only aggregate statistics.</w:t>
+      </w:r>
+    </w:p>
+    <w:p>
+      <w:pPr>
+        <w:pStyle w:val="BodyText"/>
+      </w:pPr>
+      <w:r>
+        <w:rPr>
+          <w:b/>
+          <w:bCs/>
+        </w:rPr>
+        <w:t xml:space="preserve">Author contributions.</w:t>
+      </w:r>
+      <w:r>
+        <w:t xml:space="preserve"> </w:t>
+      </w:r>
+      <w:r>
+        <w:t xml:space="preserve">A.G. conceived the study, implemented the models and analyses, and wrote the manuscript.</w:t>
+      </w:r>
+    </w:p>
+    <w:p>
+      <w:pPr>
+        <w:pStyle w:val="BodyText"/>
+      </w:pPr>
+      <w:r>
+        <w:rPr>
+          <w:b/>
+          <w:bCs/>
+        </w:rPr>
+        <w:t xml:space="preserve">Use of large language models.</w:t>
+      </w:r>
+      <w:r>
+        <w:t xml:space="preserve"> </w:t>
+      </w:r>
+      <w:r>
+        <w:t xml:space="preserve">A large language model (Claude) was used to assist with code implementation and manuscript drafting. The author reviewed, verified, and takes full responsibility for all content, including every reported result and claim.</w:t>
+      </w:r>
+    </w:p>
+    <w:bookmarkEnd w:id="40"/>
+    <w:bookmarkStart w:id="41" w:name="references"/>
     <w:p>
       <w:pPr>
         <w:pStyle w:val="Heading2"/>
@@ -694,8 +830,8 @@
         <w:t xml:space="preserve">Wong, K.-F., and Wang, X.-J. (2006). A recurrent network mechanism of time integration in perceptual decisions. Journal of Neuroscience, 26, 1314-1328.</w:t>
       </w:r>
     </w:p>
-    <w:bookmarkEnd w:id="40"/>
     <w:bookmarkEnd w:id="41"/>
+    <w:bookmarkEnd w:id="42"/>
     <w:sectPr>
       <w:footnotePr>
         <w:numRestart w:val="eachSect"/>

</xml_diff>